<commit_message>
Add ABAP scripts and update assignments 21-23
</commit_message>
<xml_diff>
--- a/Assignment 21.docx
+++ b/Assignment 21.docx
@@ -46,10 +46,93 @@
           <w:szCs w:val="28"/>
           <w:lang w:val="en-US"/>
         </w:rPr>
-        <w:t xml:space="preserve">What </w:t>
-      </w:r>
-      <w:proofErr w:type="gramStart"/>
-      <w:r>
+        <w:t>What is breakpoints and What are the types of breakpoints explore more on it?</w:t>
+      </w:r>
+    </w:p>
+    <w:p>
+      <w:pPr>
+        <w:pStyle w:val="ListParagraph"/>
+        <w:numPr>
+          <w:ilvl w:val="0"/>
+          <w:numId w:val="2"/>
+        </w:numPr>
+        <w:rPr>
+          <w:sz w:val="28"/>
+          <w:szCs w:val="28"/>
+          <w:lang w:val="en-US"/>
+        </w:rPr>
+      </w:pPr>
+      <w:r>
+        <w:rPr>
+          <w:sz w:val="28"/>
+          <w:szCs w:val="28"/>
+        </w:rPr>
+        <w:t xml:space="preserve">A Breakpoint is a stopping point in an ABAP program where execution pauses during debugging, allowing the developer to </w:t>
+      </w:r>
+      <w:proofErr w:type="spellStart"/>
+      <w:r>
+        <w:rPr>
+          <w:sz w:val="28"/>
+          <w:szCs w:val="28"/>
+        </w:rPr>
+        <w:t>anal</w:t>
+      </w:r>
+      <w:r>
+        <w:rPr>
+          <w:sz w:val="28"/>
+          <w:szCs w:val="28"/>
+        </w:rPr>
+        <w:t>y</w:t>
+      </w:r>
+      <w:r>
+        <w:rPr>
+          <w:sz w:val="28"/>
+          <w:szCs w:val="28"/>
+        </w:rPr>
+        <w:t>z</w:t>
+      </w:r>
+      <w:r>
+        <w:rPr>
+          <w:sz w:val="28"/>
+          <w:szCs w:val="28"/>
+        </w:rPr>
+        <w:t>e</w:t>
+      </w:r>
+      <w:proofErr w:type="spellEnd"/>
+      <w:r>
+        <w:rPr>
+          <w:sz w:val="28"/>
+          <w:szCs w:val="28"/>
+        </w:rPr>
+        <w:t xml:space="preserve"> program flow and variable values.</w:t>
+      </w:r>
+    </w:p>
+    <w:p>
+      <w:pPr>
+        <w:pStyle w:val="ListParagraph"/>
+        <w:numPr>
+          <w:ilvl w:val="0"/>
+          <w:numId w:val="2"/>
+        </w:numPr>
+        <w:rPr>
+          <w:sz w:val="28"/>
+          <w:szCs w:val="28"/>
+          <w:lang w:val="en-US"/>
+        </w:rPr>
+      </w:pPr>
+      <w:r>
+        <w:rPr>
+          <w:sz w:val="28"/>
+          <w:szCs w:val="28"/>
+          <w:lang w:val="en-US"/>
+        </w:rPr>
+        <w:t>Types:</w:t>
+      </w:r>
+    </w:p>
+    <w:p>
+      <w:pPr>
+        <w:pStyle w:val="ListParagraph"/>
+        <w:ind w:left="360"/>
         <w:rPr>
           <w:b/>
           <w:bCs/>
@@ -57,9 +140,7 @@
           <w:szCs w:val="28"/>
           <w:lang w:val="en-US"/>
         </w:rPr>
-        <w:t>is</w:t>
-      </w:r>
-      <w:proofErr w:type="gramEnd"/>
+      </w:pPr>
       <w:r>
         <w:rPr>
           <w:b/>
@@ -68,93 +149,307 @@
           <w:szCs w:val="28"/>
           <w:lang w:val="en-US"/>
         </w:rPr>
-        <w:t xml:space="preserve"> breakpoints and What are the types of breakpoints explore more on it?</w:t>
-      </w:r>
-    </w:p>
-    <w:p>
-      <w:pPr>
-        <w:pStyle w:val="ListParagraph"/>
-        <w:numPr>
-          <w:ilvl w:val="0"/>
-          <w:numId w:val="2"/>
-        </w:numPr>
-        <w:rPr>
-          <w:sz w:val="28"/>
-          <w:szCs w:val="28"/>
-          <w:lang w:val="en-US"/>
-        </w:rPr>
-      </w:pPr>
-      <w:r>
-        <w:rPr>
-          <w:sz w:val="28"/>
-          <w:szCs w:val="28"/>
-        </w:rPr>
-        <w:t xml:space="preserve">A Breakpoint is a stopping point in an ABAP program where execution pauses during debugging, allowing the developer to </w:t>
+        <w:t>1. Static Breakpoint:</w:t>
+      </w:r>
+    </w:p>
+    <w:p>
+      <w:pPr>
+        <w:pStyle w:val="ListParagraph"/>
+        <w:numPr>
+          <w:ilvl w:val="0"/>
+          <w:numId w:val="2"/>
+        </w:numPr>
+        <w:rPr>
+          <w:sz w:val="28"/>
+          <w:szCs w:val="28"/>
+          <w:lang w:val="en-US"/>
+        </w:rPr>
+      </w:pPr>
+      <w:r>
+        <w:rPr>
+          <w:sz w:val="28"/>
+          <w:szCs w:val="28"/>
+          <w:lang w:val="en-US"/>
+        </w:rPr>
+        <w:t>A static breakpoint is hardcoded directly into the ABAP source code using a statement.</w:t>
+      </w:r>
+    </w:p>
+    <w:p>
+      <w:pPr>
+        <w:pStyle w:val="ListParagraph"/>
+        <w:numPr>
+          <w:ilvl w:val="0"/>
+          <w:numId w:val="2"/>
+        </w:numPr>
+        <w:rPr>
+          <w:sz w:val="28"/>
+          <w:szCs w:val="28"/>
+          <w:lang w:val="en-US"/>
+        </w:rPr>
+      </w:pPr>
+      <w:r>
+        <w:rPr>
+          <w:sz w:val="28"/>
+          <w:szCs w:val="28"/>
+          <w:lang w:val="en-US"/>
+        </w:rPr>
+        <w:t>How to set: Write BREAK-POINT. or BREAK username. inside the program in SE38 or SE80.</w:t>
+      </w:r>
+    </w:p>
+    <w:p>
+      <w:pPr>
+        <w:pStyle w:val="ListParagraph"/>
+        <w:numPr>
+          <w:ilvl w:val="0"/>
+          <w:numId w:val="2"/>
+        </w:numPr>
+        <w:rPr>
+          <w:sz w:val="28"/>
+          <w:szCs w:val="28"/>
+          <w:lang w:val="en-US"/>
+        </w:rPr>
+      </w:pPr>
+      <w:r>
+        <w:rPr>
+          <w:sz w:val="28"/>
+          <w:szCs w:val="28"/>
+          <w:lang w:val="en-US"/>
+        </w:rPr>
+        <w:t>Scope: BREAK-POINT. triggers for ALL users. BREAK username. triggers only for that specific SAP username.</w:t>
+      </w:r>
+    </w:p>
+    <w:p>
+      <w:pPr>
+        <w:pStyle w:val="ListParagraph"/>
+        <w:numPr>
+          <w:ilvl w:val="0"/>
+          <w:numId w:val="2"/>
+        </w:numPr>
+        <w:rPr>
+          <w:sz w:val="28"/>
+          <w:szCs w:val="28"/>
+          <w:lang w:val="en-US"/>
+        </w:rPr>
+      </w:pPr>
+      <w:r>
+        <w:rPr>
+          <w:sz w:val="28"/>
+          <w:szCs w:val="28"/>
+          <w:lang w:val="en-US"/>
+        </w:rPr>
+        <w:t>Example:</w:t>
+      </w:r>
+    </w:p>
+    <w:p>
+      <w:pPr>
+        <w:pStyle w:val="ListParagraph"/>
+        <w:ind w:left="360"/>
+        <w:rPr>
+          <w:sz w:val="28"/>
+          <w:szCs w:val="28"/>
+          <w:lang w:val="en-US"/>
+        </w:rPr>
+      </w:pPr>
+      <w:r>
+        <w:rPr>
+          <w:sz w:val="28"/>
+          <w:szCs w:val="28"/>
+          <w:lang w:val="en-US"/>
+        </w:rPr>
+        <w:t xml:space="preserve">LOOP AT </w:t>
       </w:r>
       <w:proofErr w:type="spellStart"/>
       <w:r>
         <w:rPr>
           <w:sz w:val="28"/>
           <w:szCs w:val="28"/>
-        </w:rPr>
-        <w:t>anal</w:t>
-      </w:r>
-      <w:r>
-        <w:rPr>
-          <w:sz w:val="28"/>
-          <w:szCs w:val="28"/>
-        </w:rPr>
-        <w:t>y</w:t>
-      </w:r>
-      <w:r>
-        <w:rPr>
-          <w:sz w:val="28"/>
-          <w:szCs w:val="28"/>
-        </w:rPr>
-        <w:t>z</w:t>
-      </w:r>
-      <w:r>
-        <w:rPr>
-          <w:sz w:val="28"/>
-          <w:szCs w:val="28"/>
-        </w:rPr>
-        <w:t>e</w:t>
+          <w:lang w:val="en-US"/>
+        </w:rPr>
+        <w:t>lt_employees</w:t>
       </w:r>
       <w:proofErr w:type="spellEnd"/>
       <w:r>
         <w:rPr>
           <w:sz w:val="28"/>
           <w:szCs w:val="28"/>
-        </w:rPr>
-        <w:t xml:space="preserve"> program flow and variable values.</w:t>
-      </w:r>
-    </w:p>
-    <w:p>
-      <w:pPr>
-        <w:pStyle w:val="ListParagraph"/>
-        <w:numPr>
-          <w:ilvl w:val="0"/>
-          <w:numId w:val="2"/>
-        </w:numPr>
-        <w:rPr>
-          <w:sz w:val="28"/>
-          <w:szCs w:val="28"/>
-          <w:lang w:val="en-US"/>
-        </w:rPr>
-      </w:pPr>
-      <w:r>
-        <w:rPr>
-          <w:sz w:val="28"/>
-          <w:szCs w:val="28"/>
-          <w:lang w:val="en-US"/>
-        </w:rPr>
-        <w:t>Types:</w:t>
+          <w:lang w:val="en-US"/>
+        </w:rPr>
+        <w:t xml:space="preserve"> INTO </w:t>
+      </w:r>
+      <w:proofErr w:type="spellStart"/>
+      <w:r>
+        <w:rPr>
+          <w:sz w:val="28"/>
+          <w:szCs w:val="28"/>
+          <w:lang w:val="en-US"/>
+        </w:rPr>
+        <w:t>ls_emp</w:t>
+      </w:r>
+      <w:proofErr w:type="spellEnd"/>
+      <w:r>
+        <w:rPr>
+          <w:sz w:val="28"/>
+          <w:szCs w:val="28"/>
+          <w:lang w:val="en-US"/>
+        </w:rPr>
+        <w:t>.</w:t>
       </w:r>
     </w:p>
     <w:p>
       <w:pPr>
         <w:pStyle w:val="ListParagraph"/>
         <w:ind w:left="360"/>
+        <w:rPr>
+          <w:sz w:val="28"/>
+          <w:szCs w:val="28"/>
+          <w:lang w:val="en-US"/>
+        </w:rPr>
+      </w:pPr>
+      <w:r>
+        <w:rPr>
+          <w:sz w:val="28"/>
+          <w:szCs w:val="28"/>
+          <w:lang w:val="en-US"/>
+        </w:rPr>
+        <w:t xml:space="preserve">IF </w:t>
+      </w:r>
+      <w:proofErr w:type="spellStart"/>
+      <w:r>
+        <w:rPr>
+          <w:sz w:val="28"/>
+          <w:szCs w:val="28"/>
+          <w:lang w:val="en-US"/>
+        </w:rPr>
+        <w:t>ls_emp</w:t>
+      </w:r>
+      <w:proofErr w:type="spellEnd"/>
+      <w:r>
+        <w:rPr>
+          <w:sz w:val="28"/>
+          <w:szCs w:val="28"/>
+          <w:lang w:val="en-US"/>
+        </w:rPr>
+        <w:t>-salary &gt; 100000.</w:t>
+      </w:r>
+    </w:p>
+    <w:p>
+      <w:pPr>
+        <w:pStyle w:val="ListParagraph"/>
+        <w:ind w:left="360"/>
+        <w:rPr>
+          <w:sz w:val="28"/>
+          <w:szCs w:val="28"/>
+          <w:lang w:val="en-US"/>
+        </w:rPr>
+      </w:pPr>
+      <w:r>
+        <w:rPr>
+          <w:sz w:val="28"/>
+          <w:szCs w:val="28"/>
+          <w:lang w:val="en-US"/>
+        </w:rPr>
+        <w:t>BREAK-POINT.       "opens debugger for ALL users</w:t>
+      </w:r>
+    </w:p>
+    <w:p>
+      <w:pPr>
+        <w:pStyle w:val="ListParagraph"/>
+        <w:ind w:left="360"/>
+        <w:rPr>
+          <w:sz w:val="28"/>
+          <w:szCs w:val="28"/>
+          <w:lang w:val="en-US"/>
+        </w:rPr>
+      </w:pPr>
+      <w:r>
+        <w:rPr>
+          <w:sz w:val="28"/>
+          <w:szCs w:val="28"/>
+          <w:lang w:val="en-US"/>
+        </w:rPr>
+        <w:t xml:space="preserve">BREAK </w:t>
+      </w:r>
+      <w:r>
+        <w:rPr>
+          <w:sz w:val="28"/>
+          <w:szCs w:val="28"/>
+          <w:lang w:val="en-US"/>
+        </w:rPr>
+        <w:t>Krishna</w:t>
+      </w:r>
+      <w:r>
+        <w:rPr>
+          <w:sz w:val="28"/>
+          <w:szCs w:val="28"/>
+          <w:lang w:val="en-US"/>
+        </w:rPr>
+        <w:t>.     "opens debugger only for user KRISHNA</w:t>
+      </w:r>
+    </w:p>
+    <w:p>
+      <w:pPr>
+        <w:pStyle w:val="ListParagraph"/>
+        <w:ind w:left="360"/>
+        <w:rPr>
+          <w:sz w:val="28"/>
+          <w:szCs w:val="28"/>
+          <w:lang w:val="en-US"/>
+        </w:rPr>
+      </w:pPr>
+      <w:r>
+        <w:rPr>
+          <w:sz w:val="28"/>
+          <w:szCs w:val="28"/>
+          <w:lang w:val="en-US"/>
+        </w:rPr>
+        <w:t>ENDIF.</w:t>
+      </w:r>
+      <w:r>
+        <w:rPr>
+          <w:sz w:val="28"/>
+          <w:szCs w:val="28"/>
+          <w:lang w:val="en-US"/>
+        </w:rPr>
+        <w:t xml:space="preserve"> </w:t>
+      </w:r>
+    </w:p>
+    <w:p>
+      <w:pPr>
+        <w:pStyle w:val="ListParagraph"/>
+        <w:ind w:left="360"/>
+        <w:rPr>
+          <w:sz w:val="28"/>
+          <w:szCs w:val="28"/>
+          <w:lang w:val="en-US"/>
+        </w:rPr>
+      </w:pPr>
+      <w:r>
+        <w:rPr>
+          <w:sz w:val="28"/>
+          <w:szCs w:val="28"/>
+          <w:lang w:val="en-US"/>
+        </w:rPr>
+        <w:t>ENDLOOP.</w:t>
+      </w:r>
+    </w:p>
+    <w:p>
+      <w:pPr>
+        <w:pStyle w:val="ListParagraph"/>
+        <w:ind w:left="360"/>
+        <w:rPr>
+          <w:sz w:val="28"/>
+          <w:szCs w:val="28"/>
+          <w:lang w:val="en-US"/>
+        </w:rPr>
+      </w:pPr>
+    </w:p>
+    <w:p>
+      <w:pPr>
+        <w:pStyle w:val="ListParagraph"/>
+        <w:numPr>
+          <w:ilvl w:val="0"/>
+          <w:numId w:val="2"/>
+        </w:numPr>
         <w:rPr>
           <w:b/>
           <w:bCs/>
@@ -171,323 +466,117 @@
           <w:szCs w:val="28"/>
           <w:lang w:val="en-US"/>
         </w:rPr>
-        <w:t>1. Static Breakpoint:</w:t>
-      </w:r>
-    </w:p>
-    <w:p>
-      <w:pPr>
-        <w:pStyle w:val="ListParagraph"/>
-        <w:numPr>
-          <w:ilvl w:val="0"/>
-          <w:numId w:val="2"/>
-        </w:numPr>
-        <w:rPr>
-          <w:sz w:val="28"/>
-          <w:szCs w:val="28"/>
-          <w:lang w:val="en-US"/>
-        </w:rPr>
-      </w:pPr>
-      <w:r>
-        <w:rPr>
-          <w:sz w:val="28"/>
-          <w:szCs w:val="28"/>
-          <w:lang w:val="en-US"/>
-        </w:rPr>
-        <w:t>A static breakpoint is hardcoded directly into the ABAP source code using a statement.</w:t>
-      </w:r>
-    </w:p>
-    <w:p>
-      <w:pPr>
-        <w:pStyle w:val="ListParagraph"/>
-        <w:numPr>
-          <w:ilvl w:val="0"/>
-          <w:numId w:val="2"/>
-        </w:numPr>
-        <w:rPr>
-          <w:sz w:val="28"/>
-          <w:szCs w:val="28"/>
-          <w:lang w:val="en-US"/>
-        </w:rPr>
-      </w:pPr>
-      <w:r>
-        <w:rPr>
-          <w:sz w:val="28"/>
-          <w:szCs w:val="28"/>
-          <w:lang w:val="en-US"/>
-        </w:rPr>
-        <w:t>How to set: Write BREAK-POINT. or BREAK username. inside the program in SE38 or SE80.</w:t>
-      </w:r>
-    </w:p>
-    <w:p>
-      <w:pPr>
-        <w:pStyle w:val="ListParagraph"/>
-        <w:numPr>
-          <w:ilvl w:val="0"/>
-          <w:numId w:val="2"/>
-        </w:numPr>
-        <w:rPr>
-          <w:sz w:val="28"/>
-          <w:szCs w:val="28"/>
-          <w:lang w:val="en-US"/>
-        </w:rPr>
-      </w:pPr>
-      <w:r>
-        <w:rPr>
-          <w:sz w:val="28"/>
-          <w:szCs w:val="28"/>
-          <w:lang w:val="en-US"/>
-        </w:rPr>
-        <w:t>Scope: BREAK-POINT. triggers for ALL users. BREAK username. triggers only for that specific SAP username.</w:t>
-      </w:r>
-    </w:p>
-    <w:p>
-      <w:pPr>
-        <w:pStyle w:val="ListParagraph"/>
-        <w:numPr>
-          <w:ilvl w:val="0"/>
-          <w:numId w:val="2"/>
-        </w:numPr>
-        <w:rPr>
-          <w:sz w:val="28"/>
-          <w:szCs w:val="28"/>
-          <w:lang w:val="en-US"/>
-        </w:rPr>
-      </w:pPr>
-      <w:r>
-        <w:rPr>
-          <w:sz w:val="28"/>
-          <w:szCs w:val="28"/>
-          <w:lang w:val="en-US"/>
-        </w:rPr>
-        <w:t>Example:</w:t>
-      </w:r>
-    </w:p>
-    <w:p>
-      <w:pPr>
-        <w:pStyle w:val="ListParagraph"/>
-        <w:ind w:left="360"/>
-        <w:rPr>
-          <w:sz w:val="28"/>
-          <w:szCs w:val="28"/>
-          <w:lang w:val="en-US"/>
-        </w:rPr>
-      </w:pPr>
-      <w:r>
-        <w:rPr>
-          <w:sz w:val="28"/>
-          <w:szCs w:val="28"/>
-          <w:lang w:val="en-US"/>
-        </w:rPr>
-        <w:t xml:space="preserve">LOOP AT </w:t>
-      </w:r>
-      <w:proofErr w:type="spellStart"/>
-      <w:r>
-        <w:rPr>
-          <w:sz w:val="28"/>
-          <w:szCs w:val="28"/>
-          <w:lang w:val="en-US"/>
-        </w:rPr>
-        <w:t>lt_employees</w:t>
-      </w:r>
-      <w:proofErr w:type="spellEnd"/>
-      <w:r>
-        <w:rPr>
-          <w:sz w:val="28"/>
-          <w:szCs w:val="28"/>
-          <w:lang w:val="en-US"/>
-        </w:rPr>
-        <w:t xml:space="preserve"> INTO </w:t>
-      </w:r>
-      <w:proofErr w:type="spellStart"/>
-      <w:r>
-        <w:rPr>
-          <w:sz w:val="28"/>
-          <w:szCs w:val="28"/>
-          <w:lang w:val="en-US"/>
-        </w:rPr>
-        <w:t>ls_emp</w:t>
-      </w:r>
-      <w:proofErr w:type="spellEnd"/>
-      <w:r>
-        <w:rPr>
-          <w:sz w:val="28"/>
-          <w:szCs w:val="28"/>
-          <w:lang w:val="en-US"/>
-        </w:rPr>
-        <w:t>.</w:t>
-      </w:r>
-    </w:p>
-    <w:p>
-      <w:pPr>
-        <w:pStyle w:val="ListParagraph"/>
-        <w:ind w:left="360"/>
-        <w:rPr>
-          <w:sz w:val="28"/>
-          <w:szCs w:val="28"/>
-          <w:lang w:val="en-US"/>
-        </w:rPr>
-      </w:pPr>
-      <w:r>
-        <w:rPr>
-          <w:sz w:val="28"/>
-          <w:szCs w:val="28"/>
-          <w:lang w:val="en-US"/>
-        </w:rPr>
-        <w:t xml:space="preserve">IF </w:t>
-      </w:r>
-      <w:proofErr w:type="spellStart"/>
-      <w:r>
-        <w:rPr>
-          <w:sz w:val="28"/>
-          <w:szCs w:val="28"/>
-          <w:lang w:val="en-US"/>
-        </w:rPr>
-        <w:t>ls_emp</w:t>
-      </w:r>
-      <w:proofErr w:type="spellEnd"/>
-      <w:r>
-        <w:rPr>
-          <w:sz w:val="28"/>
-          <w:szCs w:val="28"/>
-          <w:lang w:val="en-US"/>
-        </w:rPr>
-        <w:t>-salary &gt; 100000.</w:t>
-      </w:r>
-    </w:p>
-    <w:p>
-      <w:pPr>
-        <w:pStyle w:val="ListParagraph"/>
-        <w:ind w:left="360"/>
-        <w:rPr>
-          <w:sz w:val="28"/>
-          <w:szCs w:val="28"/>
-          <w:lang w:val="en-US"/>
-        </w:rPr>
-      </w:pPr>
-      <w:r>
-        <w:rPr>
-          <w:sz w:val="28"/>
-          <w:szCs w:val="28"/>
-          <w:lang w:val="en-US"/>
-        </w:rPr>
-        <w:t>BREAK-POINT.       "</w:t>
-      </w:r>
-      <w:proofErr w:type="gramStart"/>
-      <w:r>
-        <w:rPr>
-          <w:sz w:val="28"/>
-          <w:szCs w:val="28"/>
-          <w:lang w:val="en-US"/>
-        </w:rPr>
-        <w:t>opens</w:t>
-      </w:r>
-      <w:proofErr w:type="gramEnd"/>
-      <w:r>
-        <w:rPr>
-          <w:sz w:val="28"/>
-          <w:szCs w:val="28"/>
-          <w:lang w:val="en-US"/>
-        </w:rPr>
-        <w:t xml:space="preserve"> debugger for ALL users</w:t>
-      </w:r>
-    </w:p>
-    <w:p>
-      <w:pPr>
-        <w:pStyle w:val="ListParagraph"/>
-        <w:ind w:left="360"/>
-        <w:rPr>
-          <w:sz w:val="28"/>
-          <w:szCs w:val="28"/>
-          <w:lang w:val="en-US"/>
-        </w:rPr>
-      </w:pPr>
-      <w:r>
-        <w:rPr>
-          <w:sz w:val="28"/>
-          <w:szCs w:val="28"/>
-          <w:lang w:val="en-US"/>
-        </w:rPr>
-        <w:t xml:space="preserve">BREAK </w:t>
-      </w:r>
-      <w:r>
-        <w:rPr>
-          <w:sz w:val="28"/>
-          <w:szCs w:val="28"/>
-          <w:lang w:val="en-US"/>
-        </w:rPr>
-        <w:t>Krishna</w:t>
-      </w:r>
-      <w:r>
-        <w:rPr>
-          <w:sz w:val="28"/>
-          <w:szCs w:val="28"/>
-          <w:lang w:val="en-US"/>
-        </w:rPr>
-        <w:t>.     "</w:t>
-      </w:r>
-      <w:proofErr w:type="gramStart"/>
-      <w:r>
-        <w:rPr>
-          <w:sz w:val="28"/>
-          <w:szCs w:val="28"/>
-          <w:lang w:val="en-US"/>
-        </w:rPr>
-        <w:t>opens</w:t>
-      </w:r>
-      <w:proofErr w:type="gramEnd"/>
-      <w:r>
-        <w:rPr>
-          <w:sz w:val="28"/>
-          <w:szCs w:val="28"/>
-          <w:lang w:val="en-US"/>
-        </w:rPr>
-        <w:t xml:space="preserve"> debugger only for user KRISHNA</w:t>
-      </w:r>
-    </w:p>
-    <w:p>
-      <w:pPr>
-        <w:pStyle w:val="ListParagraph"/>
-        <w:ind w:left="360"/>
-        <w:rPr>
-          <w:sz w:val="28"/>
-          <w:szCs w:val="28"/>
-          <w:lang w:val="en-US"/>
-        </w:rPr>
-      </w:pPr>
-      <w:r>
-        <w:rPr>
-          <w:sz w:val="28"/>
-          <w:szCs w:val="28"/>
-          <w:lang w:val="en-US"/>
-        </w:rPr>
-        <w:t>ENDIF.</w:t>
-      </w:r>
-      <w:r>
-        <w:rPr>
-          <w:sz w:val="28"/>
-          <w:szCs w:val="28"/>
-          <w:lang w:val="en-US"/>
-        </w:rPr>
-        <w:t xml:space="preserve"> </w:t>
-      </w:r>
-    </w:p>
-    <w:p>
-      <w:pPr>
-        <w:pStyle w:val="ListParagraph"/>
-        <w:ind w:left="360"/>
-        <w:rPr>
-          <w:sz w:val="28"/>
-          <w:szCs w:val="28"/>
-          <w:lang w:val="en-US"/>
-        </w:rPr>
-      </w:pPr>
-      <w:r>
-        <w:rPr>
-          <w:sz w:val="28"/>
-          <w:szCs w:val="28"/>
-          <w:lang w:val="en-US"/>
-        </w:rPr>
-        <w:t>ENDLOOP.</w:t>
+        <w:t>2. Dynamic Breakpoint:</w:t>
+      </w:r>
+    </w:p>
+    <w:p>
+      <w:pPr>
+        <w:pStyle w:val="ListParagraph"/>
+        <w:numPr>
+          <w:ilvl w:val="0"/>
+          <w:numId w:val="2"/>
+        </w:numPr>
+        <w:rPr>
+          <w:sz w:val="28"/>
+          <w:szCs w:val="28"/>
+          <w:lang w:val="en-US"/>
+        </w:rPr>
+      </w:pPr>
+      <w:r>
+        <w:rPr>
+          <w:sz w:val="28"/>
+          <w:szCs w:val="28"/>
+          <w:lang w:val="en-US"/>
+        </w:rPr>
+        <w:t>A dynamic breakpoint is set at runtime without any change to the source code. It is the most commonly used breakpoint in daily development.</w:t>
+      </w:r>
+    </w:p>
+    <w:p>
+      <w:pPr>
+        <w:pStyle w:val="ListParagraph"/>
+        <w:numPr>
+          <w:ilvl w:val="0"/>
+          <w:numId w:val="2"/>
+        </w:numPr>
+        <w:rPr>
+          <w:sz w:val="28"/>
+          <w:szCs w:val="28"/>
+          <w:lang w:val="en-US"/>
+        </w:rPr>
+      </w:pPr>
+      <w:r>
+        <w:rPr>
+          <w:sz w:val="28"/>
+          <w:szCs w:val="28"/>
+          <w:lang w:val="en-US"/>
+        </w:rPr>
+        <w:t>How to set: Click on the left margin (grey area) next to a line number in SE38 or SE80. A red dot appears indicating the breakpoint is active.</w:t>
+      </w:r>
+    </w:p>
+    <w:p>
+      <w:pPr>
+        <w:pStyle w:val="ListParagraph"/>
+        <w:numPr>
+          <w:ilvl w:val="0"/>
+          <w:numId w:val="2"/>
+        </w:numPr>
+        <w:rPr>
+          <w:sz w:val="28"/>
+          <w:szCs w:val="28"/>
+          <w:lang w:val="en-US"/>
+        </w:rPr>
+      </w:pPr>
+      <w:r>
+        <w:rPr>
+          <w:sz w:val="28"/>
+          <w:szCs w:val="28"/>
+          <w:lang w:val="en-US"/>
+        </w:rPr>
+        <w:t>Scope: Your user only, within your current SAP session.</w:t>
+      </w:r>
+    </w:p>
+    <w:p>
+      <w:pPr>
+        <w:pStyle w:val="ListParagraph"/>
+        <w:numPr>
+          <w:ilvl w:val="0"/>
+          <w:numId w:val="2"/>
+        </w:numPr>
+        <w:rPr>
+          <w:sz w:val="28"/>
+          <w:szCs w:val="28"/>
+          <w:lang w:val="en-US"/>
+        </w:rPr>
+      </w:pPr>
+      <w:r>
+        <w:rPr>
+          <w:sz w:val="28"/>
+          <w:szCs w:val="28"/>
+          <w:lang w:val="en-US"/>
+        </w:rPr>
+        <w:t>cleared automatically after the session ends or you log off.</w:t>
+      </w:r>
+    </w:p>
+    <w:p>
+      <w:pPr>
+        <w:pStyle w:val="ListParagraph"/>
+        <w:numPr>
+          <w:ilvl w:val="0"/>
+          <w:numId w:val="2"/>
+        </w:numPr>
+        <w:rPr>
+          <w:sz w:val="28"/>
+          <w:szCs w:val="28"/>
+          <w:lang w:val="en-US"/>
+        </w:rPr>
+      </w:pPr>
+      <w:r>
+        <w:rPr>
+          <w:sz w:val="28"/>
+          <w:szCs w:val="28"/>
+          <w:lang w:val="en-US"/>
+        </w:rPr>
+        <w:t>Program pauses at that exact line when you run it.</w:t>
       </w:r>
       <w:r>
         <w:rPr>
@@ -521,117 +610,74 @@
           <w:szCs w:val="28"/>
           <w:lang w:val="en-US"/>
         </w:rPr>
-        <w:t>2. Dynamic Breakpoint:</w:t>
-      </w:r>
-    </w:p>
-    <w:p>
-      <w:pPr>
-        <w:pStyle w:val="ListParagraph"/>
-        <w:numPr>
-          <w:ilvl w:val="0"/>
-          <w:numId w:val="2"/>
-        </w:numPr>
-        <w:rPr>
-          <w:sz w:val="28"/>
-          <w:szCs w:val="28"/>
-          <w:lang w:val="en-US"/>
-        </w:rPr>
-      </w:pPr>
-      <w:r>
-        <w:rPr>
-          <w:sz w:val="28"/>
-          <w:szCs w:val="28"/>
-          <w:lang w:val="en-US"/>
-        </w:rPr>
-        <w:t>A dynamic breakpoint is set at runtime without any change to the source code. It is the most commonly used breakpoint in daily development.</w:t>
-      </w:r>
-    </w:p>
-    <w:p>
-      <w:pPr>
-        <w:pStyle w:val="ListParagraph"/>
-        <w:numPr>
-          <w:ilvl w:val="0"/>
-          <w:numId w:val="2"/>
-        </w:numPr>
-        <w:rPr>
-          <w:sz w:val="28"/>
-          <w:szCs w:val="28"/>
-          <w:lang w:val="en-US"/>
-        </w:rPr>
-      </w:pPr>
-      <w:r>
-        <w:rPr>
-          <w:sz w:val="28"/>
-          <w:szCs w:val="28"/>
-          <w:lang w:val="en-US"/>
-        </w:rPr>
-        <w:t>How to set: Click on the left margin (grey area) next to a line number in SE38 or SE80. A red dot appears indicating the breakpoint is active.</w:t>
-      </w:r>
-    </w:p>
-    <w:p>
-      <w:pPr>
-        <w:pStyle w:val="ListParagraph"/>
-        <w:numPr>
-          <w:ilvl w:val="0"/>
-          <w:numId w:val="2"/>
-        </w:numPr>
-        <w:rPr>
-          <w:sz w:val="28"/>
-          <w:szCs w:val="28"/>
-          <w:lang w:val="en-US"/>
-        </w:rPr>
-      </w:pPr>
-      <w:r>
-        <w:rPr>
-          <w:sz w:val="28"/>
-          <w:szCs w:val="28"/>
-          <w:lang w:val="en-US"/>
-        </w:rPr>
-        <w:t>Scope: Your user only, within your current SAP session.</w:t>
-      </w:r>
-    </w:p>
-    <w:p>
-      <w:pPr>
-        <w:pStyle w:val="ListParagraph"/>
-        <w:numPr>
-          <w:ilvl w:val="0"/>
-          <w:numId w:val="2"/>
-        </w:numPr>
-        <w:rPr>
-          <w:sz w:val="28"/>
-          <w:szCs w:val="28"/>
-          <w:lang w:val="en-US"/>
-        </w:rPr>
-      </w:pPr>
-      <w:r>
-        <w:rPr>
-          <w:sz w:val="28"/>
-          <w:szCs w:val="28"/>
-          <w:lang w:val="en-US"/>
-        </w:rPr>
-        <w:t>cleared automatically after the session ends or you log off.</w:t>
-      </w:r>
-    </w:p>
-    <w:p>
-      <w:pPr>
-        <w:pStyle w:val="ListParagraph"/>
-        <w:numPr>
-          <w:ilvl w:val="0"/>
-          <w:numId w:val="2"/>
-        </w:numPr>
-        <w:rPr>
-          <w:sz w:val="28"/>
-          <w:szCs w:val="28"/>
-          <w:lang w:val="en-US"/>
-        </w:rPr>
-      </w:pPr>
-      <w:r>
-        <w:rPr>
-          <w:sz w:val="28"/>
-          <w:szCs w:val="28"/>
-          <w:lang w:val="en-US"/>
-        </w:rPr>
-        <w:t>Program pauses at that exact line when you run it.</w:t>
+        <w:t>3. Session Breakpoint:</w:t>
+      </w:r>
+    </w:p>
+    <w:p>
+      <w:pPr>
+        <w:pStyle w:val="ListParagraph"/>
+        <w:numPr>
+          <w:ilvl w:val="0"/>
+          <w:numId w:val="2"/>
+        </w:numPr>
+        <w:rPr>
+          <w:sz w:val="28"/>
+          <w:szCs w:val="28"/>
+          <w:lang w:val="en-US"/>
+        </w:rPr>
+      </w:pPr>
+      <w:r>
+        <w:rPr>
+          <w:sz w:val="28"/>
+          <w:szCs w:val="28"/>
+          <w:lang w:val="en-US"/>
+        </w:rPr>
+        <w:t>A session breakpoint is set while a transaction is already running, using the /h debugging command. It does not require touching the source code.</w:t>
+      </w:r>
+    </w:p>
+    <w:p>
+      <w:pPr>
+        <w:pStyle w:val="ListParagraph"/>
+        <w:numPr>
+          <w:ilvl w:val="0"/>
+          <w:numId w:val="2"/>
+        </w:numPr>
+        <w:rPr>
+          <w:sz w:val="28"/>
+          <w:szCs w:val="28"/>
+          <w:lang w:val="en-US"/>
+        </w:rPr>
+      </w:pPr>
+      <w:r>
+        <w:rPr>
+          <w:sz w:val="28"/>
+          <w:szCs w:val="28"/>
+          <w:lang w:val="en-US"/>
+        </w:rPr>
+        <w:lastRenderedPageBreak/>
+        <w:t>How to set: Type /h in the SAP command field and press Enter. The session switches to debug mode. You can then set breakpoints from inside the ABAP Debugger.</w:t>
+      </w:r>
+    </w:p>
+    <w:p>
+      <w:pPr>
+        <w:pStyle w:val="ListParagraph"/>
+        <w:numPr>
+          <w:ilvl w:val="0"/>
+          <w:numId w:val="2"/>
+        </w:numPr>
+        <w:rPr>
+          <w:sz w:val="28"/>
+          <w:szCs w:val="28"/>
+          <w:lang w:val="en-US"/>
+        </w:rPr>
+      </w:pPr>
+      <w:r>
+        <w:rPr>
+          <w:sz w:val="28"/>
+          <w:szCs w:val="28"/>
+          <w:lang w:val="en-US"/>
+        </w:rPr>
+        <w:t>Scope: Your user only, within the current active session.</w:t>
       </w:r>
       <w:r>
         <w:rPr>
@@ -665,74 +711,73 @@
           <w:szCs w:val="28"/>
           <w:lang w:val="en-US"/>
         </w:rPr>
-        <w:t>3. Session Breakpoint:</w:t>
-      </w:r>
-    </w:p>
-    <w:p>
-      <w:pPr>
-        <w:pStyle w:val="ListParagraph"/>
-        <w:numPr>
-          <w:ilvl w:val="0"/>
-          <w:numId w:val="2"/>
-        </w:numPr>
-        <w:rPr>
-          <w:sz w:val="28"/>
-          <w:szCs w:val="28"/>
-          <w:lang w:val="en-US"/>
-        </w:rPr>
-      </w:pPr>
-      <w:r>
-        <w:rPr>
-          <w:sz w:val="28"/>
-          <w:szCs w:val="28"/>
-          <w:lang w:val="en-US"/>
-        </w:rPr>
-        <w:t>A session breakpoint is set while a transaction is already running, using the /h debugging command. It does not require touching the source code.</w:t>
-      </w:r>
-    </w:p>
-    <w:p>
-      <w:pPr>
-        <w:pStyle w:val="ListParagraph"/>
-        <w:numPr>
-          <w:ilvl w:val="0"/>
-          <w:numId w:val="2"/>
-        </w:numPr>
-        <w:rPr>
-          <w:sz w:val="28"/>
-          <w:szCs w:val="28"/>
-          <w:lang w:val="en-US"/>
-        </w:rPr>
-      </w:pPr>
-      <w:r>
-        <w:rPr>
-          <w:sz w:val="28"/>
-          <w:szCs w:val="28"/>
-          <w:lang w:val="en-US"/>
-        </w:rPr>
-        <w:lastRenderedPageBreak/>
-        <w:t>How to set: Type /h in the SAP command field and press Enter. The session switches to debug mode. You can then set breakpoints from inside the ABAP Debugger.</w:t>
-      </w:r>
-    </w:p>
-    <w:p>
-      <w:pPr>
-        <w:pStyle w:val="ListParagraph"/>
-        <w:numPr>
-          <w:ilvl w:val="0"/>
-          <w:numId w:val="2"/>
-        </w:numPr>
-        <w:rPr>
-          <w:sz w:val="28"/>
-          <w:szCs w:val="28"/>
-          <w:lang w:val="en-US"/>
-        </w:rPr>
-      </w:pPr>
-      <w:r>
-        <w:rPr>
-          <w:sz w:val="28"/>
-          <w:szCs w:val="28"/>
-          <w:lang w:val="en-US"/>
-        </w:rPr>
-        <w:t>Scope: Your user only, within the current active session.</w:t>
+        <w:t>4. External Breakpoint:</w:t>
+      </w:r>
+    </w:p>
+    <w:p>
+      <w:pPr>
+        <w:pStyle w:val="ListParagraph"/>
+        <w:numPr>
+          <w:ilvl w:val="0"/>
+          <w:numId w:val="2"/>
+        </w:numPr>
+        <w:rPr>
+          <w:sz w:val="28"/>
+          <w:szCs w:val="28"/>
+          <w:lang w:val="en-US"/>
+        </w:rPr>
+      </w:pPr>
+      <w:r>
+        <w:rPr>
+          <w:sz w:val="28"/>
+          <w:szCs w:val="28"/>
+          <w:lang w:val="en-US"/>
+        </w:rPr>
+        <w:t>An external breakpoint is set from inside the ABAP Debugger and is stored in the system. It can trigger across sessions, including background jobs and RFC calls.</w:t>
+      </w:r>
+    </w:p>
+    <w:p>
+      <w:pPr>
+        <w:pStyle w:val="ListParagraph"/>
+        <w:numPr>
+          <w:ilvl w:val="0"/>
+          <w:numId w:val="2"/>
+        </w:numPr>
+        <w:rPr>
+          <w:sz w:val="28"/>
+          <w:szCs w:val="28"/>
+          <w:lang w:val="en-US"/>
+        </w:rPr>
+      </w:pPr>
+      <w:r>
+        <w:rPr>
+          <w:sz w:val="28"/>
+          <w:szCs w:val="28"/>
+          <w:lang w:val="en-US"/>
+        </w:rPr>
+        <w:t>How to set: Open ABAP Debugger → Breakpoints menu → Set External Breakpoint → enter program name and line number → specify the target username.</w:t>
+      </w:r>
+    </w:p>
+    <w:p>
+      <w:pPr>
+        <w:pStyle w:val="ListParagraph"/>
+        <w:numPr>
+          <w:ilvl w:val="0"/>
+          <w:numId w:val="2"/>
+        </w:numPr>
+        <w:rPr>
+          <w:sz w:val="28"/>
+          <w:szCs w:val="28"/>
+          <w:lang w:val="en-US"/>
+        </w:rPr>
+      </w:pPr>
+      <w:r>
+        <w:rPr>
+          <w:sz w:val="28"/>
+          <w:szCs w:val="28"/>
+          <w:lang w:val="en-US"/>
+        </w:rPr>
+        <w:t>Scope: Can target a specific user in any session, including background job users.</w:t>
       </w:r>
       <w:r>
         <w:rPr>
@@ -766,73 +811,73 @@
           <w:szCs w:val="28"/>
           <w:lang w:val="en-US"/>
         </w:rPr>
-        <w:t>4. External Breakpoint:</w:t>
-      </w:r>
-    </w:p>
-    <w:p>
-      <w:pPr>
-        <w:pStyle w:val="ListParagraph"/>
-        <w:numPr>
-          <w:ilvl w:val="0"/>
-          <w:numId w:val="2"/>
-        </w:numPr>
-        <w:rPr>
-          <w:sz w:val="28"/>
-          <w:szCs w:val="28"/>
-          <w:lang w:val="en-US"/>
-        </w:rPr>
-      </w:pPr>
-      <w:r>
-        <w:rPr>
-          <w:sz w:val="28"/>
-          <w:szCs w:val="28"/>
-          <w:lang w:val="en-US"/>
-        </w:rPr>
-        <w:t>An external breakpoint is set from inside the ABAP Debugger and is stored in the system. It can trigger across sessions, including background jobs and RFC calls.</w:t>
-      </w:r>
-    </w:p>
-    <w:p>
-      <w:pPr>
-        <w:pStyle w:val="ListParagraph"/>
-        <w:numPr>
-          <w:ilvl w:val="0"/>
-          <w:numId w:val="2"/>
-        </w:numPr>
-        <w:rPr>
-          <w:sz w:val="28"/>
-          <w:szCs w:val="28"/>
-          <w:lang w:val="en-US"/>
-        </w:rPr>
-      </w:pPr>
-      <w:r>
-        <w:rPr>
-          <w:sz w:val="28"/>
-          <w:szCs w:val="28"/>
-          <w:lang w:val="en-US"/>
-        </w:rPr>
-        <w:t>How to set: Open ABAP Debugger → Breakpoints menu → Set External Breakpoint → enter program name and line number → specify the target username.</w:t>
-      </w:r>
-    </w:p>
-    <w:p>
-      <w:pPr>
-        <w:pStyle w:val="ListParagraph"/>
-        <w:numPr>
-          <w:ilvl w:val="0"/>
-          <w:numId w:val="2"/>
-        </w:numPr>
-        <w:rPr>
-          <w:sz w:val="28"/>
-          <w:szCs w:val="28"/>
-          <w:lang w:val="en-US"/>
-        </w:rPr>
-      </w:pPr>
-      <w:r>
-        <w:rPr>
-          <w:sz w:val="28"/>
-          <w:szCs w:val="28"/>
-          <w:lang w:val="en-US"/>
-        </w:rPr>
-        <w:t>Scope: Can target a specific user in any session, including background job users.</w:t>
+        <w:t>5. Watchpoint:</w:t>
+      </w:r>
+    </w:p>
+    <w:p>
+      <w:pPr>
+        <w:pStyle w:val="ListParagraph"/>
+        <w:numPr>
+          <w:ilvl w:val="0"/>
+          <w:numId w:val="2"/>
+        </w:numPr>
+        <w:rPr>
+          <w:sz w:val="28"/>
+          <w:szCs w:val="28"/>
+          <w:lang w:val="en-US"/>
+        </w:rPr>
+      </w:pPr>
+      <w:r>
+        <w:rPr>
+          <w:sz w:val="28"/>
+          <w:szCs w:val="28"/>
+          <w:lang w:val="en-US"/>
+        </w:rPr>
+        <w:t>A watchpoint does not work on a specific line. Instead, it monitors a variable and pauses execution the moment that variable changes its value.</w:t>
+      </w:r>
+    </w:p>
+    <w:p>
+      <w:pPr>
+        <w:pStyle w:val="ListParagraph"/>
+        <w:numPr>
+          <w:ilvl w:val="0"/>
+          <w:numId w:val="2"/>
+        </w:numPr>
+        <w:rPr>
+          <w:sz w:val="28"/>
+          <w:szCs w:val="28"/>
+          <w:lang w:val="en-US"/>
+        </w:rPr>
+      </w:pPr>
+      <w:r>
+        <w:rPr>
+          <w:sz w:val="28"/>
+          <w:szCs w:val="28"/>
+          <w:lang w:val="en-US"/>
+        </w:rPr>
+        <w:t>How to set: Inside the running ABAP Debugger → go to the Watchpoints tab → enter the variable name → optionally set a condition.</w:t>
+      </w:r>
+    </w:p>
+    <w:p>
+      <w:pPr>
+        <w:pStyle w:val="ListParagraph"/>
+        <w:numPr>
+          <w:ilvl w:val="0"/>
+          <w:numId w:val="2"/>
+        </w:numPr>
+        <w:rPr>
+          <w:sz w:val="28"/>
+          <w:szCs w:val="28"/>
+          <w:lang w:val="en-US"/>
+        </w:rPr>
+      </w:pPr>
+      <w:r>
+        <w:rPr>
+          <w:sz w:val="28"/>
+          <w:szCs w:val="28"/>
+          <w:lang w:val="en-US"/>
+        </w:rPr>
+        <w:t>Scope: Your current debug session only.</w:t>
       </w:r>
       <w:r>
         <w:rPr>
@@ -850,6 +895,13 @@
           <w:ilvl w:val="0"/>
           <w:numId w:val="2"/>
         </w:numPr>
+        <w:rPr>
+          <w:sz w:val="28"/>
+          <w:szCs w:val="28"/>
+          <w:lang w:val="en-US"/>
+        </w:rPr>
+      </w:pPr>
+      <w:r>
         <w:rPr>
           <w:b/>
           <w:bCs/>
@@ -857,7 +909,16 @@
           <w:szCs w:val="28"/>
           <w:lang w:val="en-US"/>
         </w:rPr>
-      </w:pPr>
+        <w:t>6.</w:t>
+      </w:r>
+      <w:r>
+        <w:rPr>
+          <w:sz w:val="28"/>
+          <w:szCs w:val="28"/>
+          <w:lang w:val="en-US"/>
+        </w:rPr>
+        <w:t xml:space="preserve"> </w:t>
+      </w:r>
       <w:r>
         <w:rPr>
           <w:b/>
@@ -866,205 +927,9 @@
           <w:szCs w:val="28"/>
           <w:lang w:val="en-US"/>
         </w:rPr>
-        <w:t>5. Watchpoint:</w:t>
-      </w:r>
-    </w:p>
-    <w:p>
-      <w:pPr>
-        <w:pStyle w:val="ListParagraph"/>
-        <w:numPr>
-          <w:ilvl w:val="0"/>
-          <w:numId w:val="2"/>
-        </w:numPr>
-        <w:rPr>
-          <w:sz w:val="28"/>
-          <w:szCs w:val="28"/>
-          <w:lang w:val="en-US"/>
-        </w:rPr>
-      </w:pPr>
-      <w:r>
-        <w:rPr>
-          <w:sz w:val="28"/>
-          <w:szCs w:val="28"/>
-          <w:lang w:val="en-US"/>
-        </w:rPr>
-        <w:t>A watchpoint does not work on a specific line. Instead, it monitors a variable and pauses execution the moment that variable changes its value.</w:t>
-      </w:r>
-    </w:p>
-    <w:p>
-      <w:pPr>
-        <w:pStyle w:val="ListParagraph"/>
-        <w:numPr>
-          <w:ilvl w:val="0"/>
-          <w:numId w:val="2"/>
-        </w:numPr>
-        <w:rPr>
-          <w:sz w:val="28"/>
-          <w:szCs w:val="28"/>
-          <w:lang w:val="en-US"/>
-        </w:rPr>
-      </w:pPr>
-      <w:r>
-        <w:rPr>
-          <w:sz w:val="28"/>
-          <w:szCs w:val="28"/>
-          <w:lang w:val="en-US"/>
-        </w:rPr>
-        <w:t>How to set: Inside the running ABAP Debugger → go to the Watchpoints tab → enter the variable name → optionally set a condition.</w:t>
-      </w:r>
-    </w:p>
-    <w:p>
-      <w:pPr>
-        <w:pStyle w:val="ListParagraph"/>
-        <w:numPr>
-          <w:ilvl w:val="0"/>
-          <w:numId w:val="2"/>
-        </w:numPr>
-        <w:rPr>
-          <w:sz w:val="28"/>
-          <w:szCs w:val="28"/>
-          <w:lang w:val="en-US"/>
-        </w:rPr>
-      </w:pPr>
-      <w:r>
-        <w:rPr>
-          <w:sz w:val="28"/>
-          <w:szCs w:val="28"/>
-          <w:lang w:val="en-US"/>
-        </w:rPr>
-        <w:t>Scope: Your current debug session only.</w:t>
-      </w:r>
-      <w:r>
-        <w:rPr>
-          <w:sz w:val="28"/>
-          <w:szCs w:val="28"/>
-          <w:lang w:val="en-US"/>
-        </w:rPr>
-        <w:br/>
-      </w:r>
-    </w:p>
-    <w:p>
-      <w:pPr>
-        <w:pStyle w:val="ListParagraph"/>
-        <w:numPr>
-          <w:ilvl w:val="0"/>
-          <w:numId w:val="2"/>
-        </w:numPr>
-        <w:rPr>
-          <w:sz w:val="28"/>
-          <w:szCs w:val="28"/>
-          <w:lang w:val="en-US"/>
-        </w:rPr>
-      </w:pPr>
-      <w:r>
-        <w:rPr>
-          <w:sz w:val="28"/>
-          <w:szCs w:val="28"/>
-          <w:lang w:val="en-US"/>
-        </w:rPr>
-        <w:t>6. Conditional Breakpoint</w:t>
-      </w:r>
-    </w:p>
-    <w:p>
-      <w:pPr>
-        <w:pStyle w:val="ListParagraph"/>
-        <w:numPr>
-          <w:ilvl w:val="0"/>
-          <w:numId w:val="2"/>
-        </w:numPr>
-        <w:rPr>
-          <w:sz w:val="28"/>
-          <w:szCs w:val="28"/>
-          <w:lang w:val="en-US"/>
-        </w:rPr>
-      </w:pPr>
-      <w:r>
-        <w:rPr>
-          <w:sz w:val="28"/>
-          <w:szCs w:val="28"/>
-          <w:lang w:val="en-US"/>
-        </w:rPr>
-        <w:t>A conditional breakpoint is a normal dynamic breakpoint with an added logical condition. The debugger only pauses at that line if the condition evaluates to TRUE. If the condition is FALSE, execution continues without stopping.</w:t>
-      </w:r>
-    </w:p>
-    <w:p>
-      <w:pPr>
-        <w:pStyle w:val="ListParagraph"/>
-        <w:numPr>
-          <w:ilvl w:val="0"/>
-          <w:numId w:val="2"/>
-        </w:numPr>
-        <w:rPr>
-          <w:sz w:val="28"/>
-          <w:szCs w:val="28"/>
-          <w:lang w:val="en-US"/>
-        </w:rPr>
-      </w:pPr>
-      <w:r>
-        <w:rPr>
-          <w:sz w:val="28"/>
-          <w:szCs w:val="28"/>
-          <w:lang w:val="en-US"/>
-        </w:rPr>
-        <w:t>How to set: Set a normal dynamic breakpoint (click left margin) → right-click the red dot → select Set/Delete Breakpoint Condition → enter your logical expression.</w:t>
-      </w:r>
-    </w:p>
-    <w:p>
-      <w:pPr>
-        <w:pStyle w:val="ListParagraph"/>
-        <w:numPr>
-          <w:ilvl w:val="0"/>
-          <w:numId w:val="2"/>
-        </w:numPr>
-        <w:rPr>
-          <w:sz w:val="28"/>
-          <w:szCs w:val="28"/>
-          <w:lang w:val="en-US"/>
-        </w:rPr>
-      </w:pPr>
-      <w:r>
-        <w:rPr>
-          <w:sz w:val="28"/>
-          <w:szCs w:val="28"/>
-          <w:lang w:val="en-US"/>
-        </w:rPr>
-        <w:t>Scope: Your session only (same as a dynamic breakpoint).</w:t>
-      </w:r>
-    </w:p>
-    <w:p>
-      <w:pPr>
-        <w:rPr>
-          <w:sz w:val="28"/>
-          <w:szCs w:val="28"/>
-          <w:lang w:val="en-US"/>
-        </w:rPr>
-      </w:pPr>
-    </w:p>
-    <w:p>
-      <w:pPr>
-        <w:rPr>
-          <w:sz w:val="28"/>
-          <w:szCs w:val="28"/>
-          <w:lang w:val="en-US"/>
-        </w:rPr>
-      </w:pPr>
-    </w:p>
-    <w:p>
-      <w:pPr>
-        <w:rPr>
-          <w:sz w:val="28"/>
-          <w:szCs w:val="28"/>
-          <w:lang w:val="en-US"/>
-        </w:rPr>
-      </w:pPr>
-    </w:p>
-    <w:p>
-      <w:pPr>
-        <w:pStyle w:val="ListParagraph"/>
-        <w:numPr>
-          <w:ilvl w:val="0"/>
-          <w:numId w:val="1"/>
-        </w:numPr>
+        <w:t>Conditional Breakpoint</w:t>
+      </w:r>
+      <w:r>
         <w:rPr>
           <w:b/>
           <w:bCs/>
@@ -1072,8 +937,109 @@
           <w:szCs w:val="28"/>
           <w:lang w:val="en-US"/>
         </w:rPr>
-      </w:pPr>
-      <w:r>
+        <w:t>:</w:t>
+      </w:r>
+    </w:p>
+    <w:p>
+      <w:pPr>
+        <w:pStyle w:val="ListParagraph"/>
+        <w:numPr>
+          <w:ilvl w:val="0"/>
+          <w:numId w:val="2"/>
+        </w:numPr>
+        <w:rPr>
+          <w:sz w:val="28"/>
+          <w:szCs w:val="28"/>
+          <w:lang w:val="en-US"/>
+        </w:rPr>
+      </w:pPr>
+      <w:r>
+        <w:rPr>
+          <w:sz w:val="28"/>
+          <w:szCs w:val="28"/>
+          <w:lang w:val="en-US"/>
+        </w:rPr>
+        <w:t>A conditional breakpoint is a normal dynamic breakpoint with an added logical condition. The debugger only pauses at that line if the condition evaluates to TRUE. If the condition is FALSE, execution continues without stopping.</w:t>
+      </w:r>
+    </w:p>
+    <w:p>
+      <w:pPr>
+        <w:pStyle w:val="ListParagraph"/>
+        <w:numPr>
+          <w:ilvl w:val="0"/>
+          <w:numId w:val="2"/>
+        </w:numPr>
+        <w:rPr>
+          <w:sz w:val="28"/>
+          <w:szCs w:val="28"/>
+          <w:lang w:val="en-US"/>
+        </w:rPr>
+      </w:pPr>
+      <w:r>
+        <w:rPr>
+          <w:sz w:val="28"/>
+          <w:szCs w:val="28"/>
+          <w:lang w:val="en-US"/>
+        </w:rPr>
+        <w:t>How to set: Set a normal dynamic breakpoint (click left margin) → right-click the red dot → select Set/Delete Breakpoint Condition → enter your logical expression.</w:t>
+      </w:r>
+    </w:p>
+    <w:p>
+      <w:pPr>
+        <w:pStyle w:val="ListParagraph"/>
+        <w:numPr>
+          <w:ilvl w:val="0"/>
+          <w:numId w:val="2"/>
+        </w:numPr>
+        <w:rPr>
+          <w:sz w:val="28"/>
+          <w:szCs w:val="28"/>
+          <w:lang w:val="en-US"/>
+        </w:rPr>
+      </w:pPr>
+      <w:r>
+        <w:rPr>
+          <w:sz w:val="28"/>
+          <w:szCs w:val="28"/>
+          <w:lang w:val="en-US"/>
+        </w:rPr>
+        <w:t>Scope: Your session only (same as a dynamic breakpoint).</w:t>
+      </w:r>
+    </w:p>
+    <w:p>
+      <w:pPr>
+        <w:rPr>
+          <w:sz w:val="28"/>
+          <w:szCs w:val="28"/>
+          <w:lang w:val="en-US"/>
+        </w:rPr>
+      </w:pPr>
+    </w:p>
+    <w:p>
+      <w:pPr>
+        <w:rPr>
+          <w:sz w:val="28"/>
+          <w:szCs w:val="28"/>
+          <w:lang w:val="en-US"/>
+        </w:rPr>
+      </w:pPr>
+    </w:p>
+    <w:p>
+      <w:pPr>
+        <w:rPr>
+          <w:sz w:val="28"/>
+          <w:szCs w:val="28"/>
+          <w:lang w:val="en-US"/>
+        </w:rPr>
+      </w:pPr>
+    </w:p>
+    <w:p>
+      <w:pPr>
+        <w:pStyle w:val="ListParagraph"/>
+        <w:numPr>
+          <w:ilvl w:val="0"/>
+          <w:numId w:val="1"/>
+        </w:numPr>
         <w:rPr>
           <w:b/>
           <w:bCs/>
@@ -1081,10 +1047,7 @@
           <w:szCs w:val="28"/>
           <w:lang w:val="en-US"/>
         </w:rPr>
-        <w:lastRenderedPageBreak/>
-        <w:t xml:space="preserve">What is </w:t>
-      </w:r>
-      <w:proofErr w:type="gramStart"/>
+      </w:pPr>
       <w:r>
         <w:rPr>
           <w:b/>
@@ -1093,18 +1056,8 @@
           <w:szCs w:val="28"/>
           <w:lang w:val="en-US"/>
         </w:rPr>
-        <w:t>watchpoint ?</w:t>
-      </w:r>
-      <w:proofErr w:type="gramEnd"/>
-      <w:r>
-        <w:rPr>
-          <w:b/>
-          <w:bCs/>
-          <w:sz w:val="28"/>
-          <w:szCs w:val="28"/>
-          <w:lang w:val="en-US"/>
-        </w:rPr>
-        <w:t xml:space="preserve"> How to create watchpoint?</w:t>
+        <w:lastRenderedPageBreak/>
+        <w:t>What is watchpoint ? How to create watchpoint?</w:t>
       </w:r>
     </w:p>
     <w:p>

</xml_diff>